<commit_message>
Creación de script vistas.sql con las 3 vistas del sistema
</commit_message>
<xml_diff>
--- a/Propuesta_Sistema.docx
+++ b/Propuesta_Sistema.docx
@@ -596,6 +596,13 @@
                 <w:szCs w:val="28"/>
               </w:rPr>
             </w:pPr>
+            <w:r>
+              <w:rPr>
+                <w:sz w:val="28"/>
+                <w:szCs w:val="28"/>
+              </w:rPr>
+              <w:t>Battiato, Lucas</w:t>
+            </w:r>
           </w:p>
         </w:tc>
         <w:tc>
@@ -620,6 +627,13 @@
                 <w:szCs w:val="28"/>
               </w:rPr>
             </w:pPr>
+            <w:r>
+              <w:rPr>
+                <w:sz w:val="28"/>
+                <w:szCs w:val="28"/>
+              </w:rPr>
+              <w:t>lucas.battiato@alumnos.frgp.utn.edu.ar</w:t>
+            </w:r>
           </w:p>
         </w:tc>
       </w:tr>
@@ -650,6 +664,13 @@
                 <w:szCs w:val="28"/>
               </w:rPr>
             </w:pPr>
+            <w:r>
+              <w:rPr>
+                <w:sz w:val="28"/>
+                <w:szCs w:val="28"/>
+              </w:rPr>
+              <w:t>Gieco, Ricardo</w:t>
+            </w:r>
           </w:p>
         </w:tc>
         <w:tc>
@@ -674,6 +695,13 @@
                 <w:szCs w:val="28"/>
               </w:rPr>
             </w:pPr>
+            <w:r>
+              <w:rPr>
+                <w:sz w:val="28"/>
+                <w:szCs w:val="28"/>
+              </w:rPr>
+              <w:t>ricardo.gieco@alumnos.frgp.utn.edu.ar</w:t>
+            </w:r>
           </w:p>
         </w:tc>
       </w:tr>
@@ -749,7 +777,10 @@
         <w:spacing w:after="200"/>
       </w:pPr>
       <w:r>
-        <w:t>Para dar de alta una solicitud, el cliente deberá estar previamente registrado en el sistema y no contar con ningún préstamo activo. Deberá seleccionar un producto, indicar el monto solicitado y la cantidad de cuotas deseada. El sistema validará que el monto esté dentro del rango permitido por el producto y que la cantidad de cuotas se encuentre dentro del rango habilitado. A partir de estos datos, calculará automáticamente la tasa de interés correspondiente al tramo de cuotas seleccionado, el interés total y el monto de cada cuota, presentando al cliente el resumen del plan antes de confirmar la solicitud.</w:t>
+        <w:t>Para dar de alta una solicitud, el cliente deberá estar previamente registrado en el sistema y no contar con ningún préstamo activo. Deberá seleccionar un producto, indicar el monto solicitado y la cantidad de cuotas deseada. El sistema validará que el monto esté dentro del rango permitido por el producto y que la cantidad de cuotas se encuentre dentro del rango habilitado. A partir de estos datos, calculará automáticamente la tasa de interés correspondiente al tramo de cuotas seleccionado, el interés total</w:t>
+      </w:r>
+      <w:r>
+        <w:t xml:space="preserve"> y el monto de cada cuota, presentando al cliente el resumen del plan antes de confirmar la solicitud.</w:t>
       </w:r>
     </w:p>
     <w:p>
@@ -17794,6 +17825,7 @@
   <w:style w:type="character" w:default="1" w:styleId="Fuentedeprrafopredeter">
     <w:name w:val="Default Paragraph Font"/>
     <w:uiPriority w:val="1"/>
+    <w:semiHidden/>
     <w:unhideWhenUsed/>
   </w:style>
   <w:style w:type="table" w:default="1" w:styleId="Tablanormal">

</xml_diff>